<commit_message>
added hippocampal volumes to demo table
</commit_message>
<xml_diff>
--- a/demo_table.docx
+++ b/demo_table.docx
@@ -430,7 +430,7 @@
                 <w:bCs/>
                 <w:b/>
               </w:rPr>
-              <w:t xml:space="preserve">Anxiety (HADS)</w:t>
+              <w:t xml:space="preserve">left hippocampus</w:t>
             </w:r>
           </w:p>
         </w:tc>
@@ -466,7 +466,7 @@
               <w:jc w:val="right"/>
             </w:pPr>
             <w:r>
-              <w:t xml:space="preserve">&lt; 0.001</w:t>
+              <w:t xml:space="preserve">0.306</w:t>
             </w:r>
           </w:p>
         </w:tc>
@@ -492,6 +492,18 @@
               <w:jc w:val="center"/>
             </w:pPr>
             <w:r>
+              <w:t xml:space="preserve">0</w:t>
+            </w:r>
+          </w:p>
+        </w:tc>
+        <w:tc>
+          <w:tcPr/>
+          <w:p>
+            <w:pPr>
+              <w:pStyle w:val="Compact"/>
+              <w:jc w:val="center"/>
+            </w:pPr>
+            <w:r>
               <w:t xml:space="preserve">1</w:t>
             </w:r>
           </w:p>
@@ -505,18 +517,6 @@
             </w:pPr>
             <w:r>
               <w:t xml:space="preserve">1</w:t>
-            </w:r>
-          </w:p>
-        </w:tc>
-        <w:tc>
-          <w:tcPr/>
-          <w:p>
-            <w:pPr>
-              <w:pStyle w:val="Compact"/>
-              <w:jc w:val="center"/>
-            </w:pPr>
-            <w:r>
-              <w:t xml:space="preserve">2</w:t>
             </w:r>
           </w:p>
         </w:tc>
@@ -550,31 +550,31 @@
               <w:jc w:val="center"/>
             </w:pPr>
             <w:r>
-              <w:t xml:space="preserve">5.063 (3.687)</w:t>
-            </w:r>
-          </w:p>
-        </w:tc>
-        <w:tc>
-          <w:tcPr/>
-          <w:p>
-            <w:pPr>
-              <w:pStyle w:val="Compact"/>
-              <w:jc w:val="center"/>
-            </w:pPr>
-            <w:r>
-              <w:t xml:space="preserve">3.772 (2.752)</w:t>
-            </w:r>
-          </w:p>
-        </w:tc>
-        <w:tc>
-          <w:tcPr/>
-          <w:p>
-            <w:pPr>
-              <w:pStyle w:val="Compact"/>
-              <w:jc w:val="center"/>
-            </w:pPr>
-            <w:r>
-              <w:t xml:space="preserve">4.276 (3.207)</w:t>
+              <w:t xml:space="preserve">2.650 (0.299)</w:t>
+            </w:r>
+          </w:p>
+        </w:tc>
+        <w:tc>
+          <w:tcPr/>
+          <w:p>
+            <w:pPr>
+              <w:pStyle w:val="Compact"/>
+              <w:jc w:val="center"/>
+            </w:pPr>
+            <w:r>
+              <w:t xml:space="preserve">2.685 (0.300)</w:t>
+            </w:r>
+          </w:p>
+        </w:tc>
+        <w:tc>
+          <w:tcPr/>
+          <w:p>
+            <w:pPr>
+              <w:pStyle w:val="Compact"/>
+              <w:jc w:val="center"/>
+            </w:pPr>
+            <w:r>
+              <w:t xml:space="preserve">2.671 (0.300)</w:t>
             </w:r>
           </w:p>
         </w:tc>
@@ -608,31 +608,31 @@
               <w:jc w:val="center"/>
             </w:pPr>
             <w:r>
-              <w:t xml:space="preserve">0.000 - 20.000</w:t>
-            </w:r>
-          </w:p>
-        </w:tc>
-        <w:tc>
-          <w:tcPr/>
-          <w:p>
-            <w:pPr>
-              <w:pStyle w:val="Compact"/>
-              <w:jc w:val="center"/>
-            </w:pPr>
-            <w:r>
-              <w:t xml:space="preserve">0.000 - 13.000</w:t>
-            </w:r>
-          </w:p>
-        </w:tc>
-        <w:tc>
-          <w:tcPr/>
-          <w:p>
-            <w:pPr>
-              <w:pStyle w:val="Compact"/>
-              <w:jc w:val="center"/>
-            </w:pPr>
-            <w:r>
-              <w:t xml:space="preserve">0.000 - 20.000</w:t>
+              <w:t xml:space="preserve">1.927 - 3.366</w:t>
+            </w:r>
+          </w:p>
+        </w:tc>
+        <w:tc>
+          <w:tcPr/>
+          <w:p>
+            <w:pPr>
+              <w:pStyle w:val="Compact"/>
+              <w:jc w:val="center"/>
+            </w:pPr>
+            <w:r>
+              <w:t xml:space="preserve">1.811 - 3.509</w:t>
+            </w:r>
+          </w:p>
+        </w:tc>
+        <w:tc>
+          <w:tcPr/>
+          <w:p>
+            <w:pPr>
+              <w:pStyle w:val="Compact"/>
+              <w:jc w:val="center"/>
+            </w:pPr>
+            <w:r>
+              <w:t xml:space="preserve">1.811 - 3.509</w:t>
             </w:r>
           </w:p>
         </w:tc>
@@ -658,7 +658,7 @@
                 <w:bCs/>
                 <w:b/>
               </w:rPr>
-              <w:t xml:space="preserve">Depression (HADS)</w:t>
+              <w:t xml:space="preserve">right hippocampus</w:t>
             </w:r>
           </w:p>
         </w:tc>
@@ -694,7 +694,7 @@
               <w:jc w:val="right"/>
             </w:pPr>
             <w:r>
-              <w:t xml:space="preserve">0.001</w:t>
+              <w:t xml:space="preserve">0.534</w:t>
             </w:r>
           </w:p>
         </w:tc>
@@ -732,19 +732,19 @@
               <w:jc w:val="center"/>
             </w:pPr>
             <w:r>
-              <w:t xml:space="preserve">3</w:t>
-            </w:r>
-          </w:p>
-        </w:tc>
-        <w:tc>
-          <w:tcPr/>
-          <w:p>
-            <w:pPr>
-              <w:pStyle w:val="Compact"/>
-              <w:jc w:val="center"/>
-            </w:pPr>
-            <w:r>
-              <w:t xml:space="preserve">3</w:t>
+              <w:t xml:space="preserve">1</w:t>
+            </w:r>
+          </w:p>
+        </w:tc>
+        <w:tc>
+          <w:tcPr/>
+          <w:p>
+            <w:pPr>
+              <w:pStyle w:val="Compact"/>
+              <w:jc w:val="center"/>
+            </w:pPr>
+            <w:r>
+              <w:t xml:space="preserve">1</w:t>
             </w:r>
           </w:p>
         </w:tc>
@@ -778,31 +778,31 @@
               <w:jc w:val="center"/>
             </w:pPr>
             <w:r>
-              <w:t xml:space="preserve">3.488 (2.624)</w:t>
-            </w:r>
-          </w:p>
-        </w:tc>
-        <w:tc>
-          <w:tcPr/>
-          <w:p>
-            <w:pPr>
-              <w:pStyle w:val="Compact"/>
-              <w:jc w:val="center"/>
-            </w:pPr>
-            <w:r>
-              <w:t xml:space="preserve">2.615 (2.218)</w:t>
-            </w:r>
-          </w:p>
-        </w:tc>
-        <w:tc>
-          <w:tcPr/>
-          <w:p>
-            <w:pPr>
-              <w:pStyle w:val="Compact"/>
-              <w:jc w:val="center"/>
-            </w:pPr>
-            <w:r>
-              <w:t xml:space="preserve">2.960 (2.420)</w:t>
+              <w:t xml:space="preserve">2.728 (0.295)</w:t>
+            </w:r>
+          </w:p>
+        </w:tc>
+        <w:tc>
+          <w:tcPr/>
+          <w:p>
+            <w:pPr>
+              <w:pStyle w:val="Compact"/>
+              <w:jc w:val="center"/>
+            </w:pPr>
+            <w:r>
+              <w:t xml:space="preserve">2.749 (0.310)</w:t>
+            </w:r>
+          </w:p>
+        </w:tc>
+        <w:tc>
+          <w:tcPr/>
+          <w:p>
+            <w:pPr>
+              <w:pStyle w:val="Compact"/>
+              <w:jc w:val="center"/>
+            </w:pPr>
+            <w:r>
+              <w:t xml:space="preserve">2.741 (0.304)</w:t>
             </w:r>
           </w:p>
         </w:tc>
@@ -836,31 +836,31 @@
               <w:jc w:val="center"/>
             </w:pPr>
             <w:r>
-              <w:t xml:space="preserve">0.000 - 12.000</w:t>
-            </w:r>
-          </w:p>
-        </w:tc>
-        <w:tc>
-          <w:tcPr/>
-          <w:p>
-            <w:pPr>
-              <w:pStyle w:val="Compact"/>
-              <w:jc w:val="center"/>
-            </w:pPr>
-            <w:r>
-              <w:t xml:space="preserve">0.000 - 12.000</w:t>
-            </w:r>
-          </w:p>
-        </w:tc>
-        <w:tc>
-          <w:tcPr/>
-          <w:p>
-            <w:pPr>
-              <w:pStyle w:val="Compact"/>
-              <w:jc w:val="center"/>
-            </w:pPr>
-            <w:r>
-              <w:t xml:space="preserve">0.000 - 12.000</w:t>
+              <w:t xml:space="preserve">1.877 - 3.494</w:t>
+            </w:r>
+          </w:p>
+        </w:tc>
+        <w:tc>
+          <w:tcPr/>
+          <w:p>
+            <w:pPr>
+              <w:pStyle w:val="Compact"/>
+              <w:jc w:val="center"/>
+            </w:pPr>
+            <w:r>
+              <w:t xml:space="preserve">1.939 - 3.436</w:t>
+            </w:r>
+          </w:p>
+        </w:tc>
+        <w:tc>
+          <w:tcPr/>
+          <w:p>
+            <w:pPr>
+              <w:pStyle w:val="Compact"/>
+              <w:jc w:val="center"/>
+            </w:pPr>
+            <w:r>
+              <w:t xml:space="preserve">1.877 - 3.494</w:t>
             </w:r>
           </w:p>
         </w:tc>

</xml_diff>